<commit_message>
Datensatz auf 18 Monate erweitern, Statistik-Notebook ergänzen, Doku/PPT/Dashboard aktualisieren
Rohdaten um Januar–März 2025 erweitert (jetzt 18 Berichtsmonate, Jan 2025–Jun 2026).
Notebooks, MD-Doku und README auf die neuen Kennzahlen angepasst. Neues Notebook
03_Statistik.ipynb (Korrelation, Hypothesentest, Regression) inkl. MD/03_Statistik.md.
Projektdokumentation und -präsentation um Kapitel "Vertiefte statistische Analyse"
ergänzt und durchgängig auf die 18-Monats-Zahlen aktualisiert. Tabellen-Scrollbar-Fix
im Dashboard nachgezogen.

Co-Authored-By: Claude Sonnet 5 <noreply@anthropic.com>
</commit_message>
<xml_diff>
--- a/Dok/Projektdokumentation.docx
+++ b/Dok/Projektdokumentation.docx
@@ -72,7 +72,6 @@
             <w:tcW w:type="dxa" w:w="4320"/>
           </w:tcPr>
           <w:p>
-            <w:r/>
             <w:r>
               <w:t>Eugenia Funk</w:t>
             </w:r>
@@ -98,7 +97,6 @@
             <w:tcW w:type="dxa" w:w="4320"/>
           </w:tcPr>
           <w:p>
-            <w:r/>
             <w:r>
               <w:t>17.08.2026</w:t>
             </w:r>
@@ -125,7 +123,7 @@
           </w:tcPr>
           <w:p>
             <w:r>
-              <w:t>April 2025 – Juni 2026</w:t>
+              <w:t>Januar 2025 – Juni 2026</w:t>
             </w:r>
           </w:p>
         </w:tc>
@@ -200,6 +198,7 @@
       </w:r>
     </w:p>
     <w:p>
+      <w:pPr/>
       <w:r>
         <w:t>Die Bundesagentur für Arbeit veröffentlicht monatlich detaillierte Arbeitsmarktstatistiken für jedes Jobcenter in Deutschland — den Bericht „Eckwerte für Jobcenter“. Diese Berichte enthalten für den Rechtskreis SGB II (Grundsicherung für Arbeitsuchende, umgangssprachlich „Bürgergeld“) zentrale Kennzahlen wie den Bestand an Arbeitslosen, die Arbeitslosenquote, die Zahl der Langzeitarbeitslosen sowie Kennzahlen zu Bedarfsgemeinschaften und Personen im Leistungsbezug. Für das Jobcenter Regensburg liegen diese Berichte als monatliche Excel-Dateien vor, jede mit über 20 Tabellenblättern und einer Vielzahl an Einzelwerten. In dieser Rohform sind Entwicklungen über die Zeit und Zusammenhänge zwischen den Kennzahlen nur schwer zu erkennen.</w:t>
       </w:r>
@@ -213,8 +212,9 @@
       </w:r>
     </w:p>
     <w:p>
+      <w:pPr/>
       <w:r>
-        <w:t>Ziel dieses Projekts ist es, aus den monatlichen Rohdaten des Jobcenters Regensburg eine strukturierte, nachvollziehbare Zeitreihe aufzubauen und die Entwicklung der Arbeitslosigkeit sowie angrenzender Kennzahlen im Rechtskreis SGB II über einen Zeitraum von 15 Monaten auszuwerten und zu visualisieren. Der Fokus liegt dabei auf:</w:t>
+        <w:t>Ziel dieses Projekts ist es, aus den monatlichen Rohdaten des Jobcenters Regensburg eine strukturierte, nachvollziehbare Zeitreihe aufzubauen und die Entwicklung der Arbeitslosigkeit sowie angrenzender Kennzahlen im Rechtskreis SGB II über einen Zeitraum von 18 Monaten auszuwerten und zu visualisieren. Der Fokus liegt dabei auf:</w:t>
       </w:r>
     </w:p>
     <w:p>
@@ -238,7 +238,7 @@
         <w:pStyle w:val="ListBullet"/>
       </w:pPr>
       <w:r>
-        <w:t>der Ableitung inhaltlicher Erkenntnisse aus den Daten sowie</w:t>
+        <w:t>der Ableitung inhaltlicher und statistischer Erkenntnisse aus den Daten sowie</w:t>
       </w:r>
     </w:p>
     <w:p>
@@ -258,8 +258,9 @@
       </w:r>
     </w:p>
     <w:p>
+      <w:pPr/>
       <w:r>
-        <w:t>Datengrundlage sind 15 monatliche Excel-Berichte „Eckwerte für Jobcenter“ für das Jobcenter Regensburg (April 2025 bis Juni 2026, Statistik-Nr. t73906-0). Jede Datei enthält den aktuellen Monatswert je Merkmal, getrennt nach „Insgesamt (SGB II und SGB III)“ und „Rechtskreis SGB II“ (= Jobcenter-Zuständigkeit). Ausgewertet wird ausschließlich der SGB-II-Anteil. Herausgeberin ist die Statistik der Bundesagentur für Arbeit.</w:t>
+        <w:t>Datengrundlage sind 18 monatliche Excel-Berichte „Eckwerte für Jobcenter“ für das Jobcenter Regensburg (Januar 2025 bis Juni 2026, Statistik-Nr. t73906-0). Jede Datei enthält den aktuellen Monatswert je Merkmal, getrennt nach „Insgesamt (SGB II und SGB III)“ und „Rechtskreis SGB II“ (= Jobcenter-Zuständigkeit). Ausgewertet wird ausschließlich der SGB-II-Anteil. Herausgeberin ist die Statistik der Bundesagentur für Arbeit.</w:t>
       </w:r>
     </w:p>
     <w:p>
@@ -271,8 +272,9 @@
       </w:r>
     </w:p>
     <w:p>
+      <w:pPr/>
       <w:r>
-        <w:t>Diese Dokumentation folgt dem tatsächlichen Projektablauf und ist in zwei inhaltliche Hauptteile gegliedert, die den beiden Jupyter-Notebooks des Projekts entsprechen: Kapitel 2 beschreibt die Datenexploration und -aufbereitung (Notebook „01_Exploration.ipynb“), Kapitel 3 die Datenanalyse und Visualisierung (Notebook „02_Analyse_SGBII.ipynb“). Kapitel 4 fasst die Ergebnisse zusammen und gibt einen Ausblick auf mögliche Erweiterungen. Die folgenden Kapitel werden nacheinander mit den jeweiligen Inhalten aus den beiden Notebooks befüllt.</w:t>
+        <w:t>Diese Dokumentation folgt dem tatsächlichen Projektablauf und ist in Hauptteile gegliedert, die den Jupyter-Notebooks des Projekts entsprechen: Kapitel 2 beschreibt die Datenexploration und -aufbereitung (Notebook „01_Exploration.ipynb“), Kapitel 3 die Datenanalyse und Visualisierung (Notebook „02_Analyse_SGBII.ipynb“) und Kapitel 4 die vertiefte statistische Analyse (Notebook „03_Statistik.ipynb“). Kapitel 5 fasst die Ergebnisse zusammen und gibt einen Ausblick auf mögliche Erweiterungen.</w:t>
       </w:r>
     </w:p>
     <w:p>
@@ -289,6 +291,7 @@
       </w:r>
     </w:p>
     <w:p>
+      <w:pPr/>
       <w:r>
         <w:t>Bevor die eigentliche Analyse beginnen kann, müssen die Rohdaten eingelesen, auf ihre Struktur hin untersucht, bereinigt und in ein für die Auswertung geeignetes Format überführt werden. Dieser Schritt ist Gegenstand des Notebooks „01_Exploration.ipynb“ und wird in den folgenden Unterkapiteln dokumentiert.</w:t>
       </w:r>
@@ -304,7 +307,7 @@
     <w:p>
       <w:pPr/>
       <w:r>
-        <w:t>Jede der 15 Excel-Dateien enthält 21 Tabellenblätter, nicht nur das Blatt „1.1 Eckwerte“. Bevor die eigentliche Datenpipeline aufgebaut wurde, sind daher zunächst alle Blätter systematisch gesichtet worden: Für jedes Blatt wurde per Skript geprüft, welche Daten enthalten sind, ob sie für die SGB-II-Arbeitslosenanalyse relevant sind, und welche Diagramme sich daraus grundsätzlich ableiten ließen.</w:t>
+        <w:t>Jede der 18 Excel-Dateien enthält 21 Tabellenblätter, nicht nur das Blatt „1.1 Eckwerte“. Bevor die eigentliche Datenpipeline aufgebaut wurde, sind daher zunächst alle Blätter systematisch gesichtet worden: Für jedes Blatt wurde per Skript geprüft, welche Daten enthalten sind, ob sie für die SGB-II-Arbeitslosenanalyse relevant sind, und welche Diagramme sich daraus grundsätzlich ableiten ließen.</w:t>
       </w:r>
     </w:p>
     <w:p>
@@ -348,7 +351,7 @@
     <w:p>
       <w:pPr/>
       <w:r>
-        <w:t>Auf Basis dieser Sichtung wurde entschieden, die Kernanalyse auf das Blatt „1.1 Eckwerte“ zu stützen; die übrigen Blätter sind als Erweiterungspotenzial für künftige Analyseschritte dokumentiert (siehe Kapitel 4).</w:t>
+        <w:t>Auf Basis dieser Sichtung wurde entschieden, die Kernanalyse auf das Blatt „1.1 Eckwerte“ zu stützen; die übrigen Blätter sind als Erweiterungspotenzial für künftige Analyseschritte dokumentiert (siehe Kapitel 5).</w:t>
       </w:r>
     </w:p>
     <w:p>
@@ -362,7 +365,7 @@
     <w:p>
       <w:pPr/>
       <w:r>
-        <w:t>Das Einlesen der 15 Monatsdateien erfolgt über zwei Funktionen:</w:t>
+        <w:t>Das Einlesen der 18 Monatsdateien erfolgt über zwei Funktionen:</w:t>
       </w:r>
     </w:p>
     <w:p>
@@ -384,7 +387,7 @@
     <w:p>
       <w:pPr/>
       <w:r>
-        <w:t>Alle 15 Dateien werden auf diese Weise geparst und zu einem gemeinsamen DataFrame zusammengeführt. Ergänzend werden die Spalten „jahr“ und „monat“ (aus dem Berichtsmonat) sowie ein kombinierter Schlüssel „label“ (Kategorie | Merkmal) angelegt. Letzterer löst Namenskollisionen auf, die entstehen, weil z. B. das Merkmal „Bestand“ sowohl bei „Arbeitsuchende“, „Arbeitslose“ als auch bei „gemeldete Arbeitsstellen“ vorkommt.</w:t>
+        <w:t>Alle 18 Dateien werden auf diese Weise geparst und zu einem gemeinsamen DataFrame zusammengeführt. Ergänzend werden die Spalten „jahr“ und „monat“ (aus dem Berichtsmonat) sowie ein kombinierter Schlüssel „label“ (Kategorie | Merkmal) angelegt. Letzterer löst Namenskollisionen auf, die entstehen, weil z. B. das Merkmal „Bestand“ sowohl bei „Arbeitsuchende“, „Arbeitslose“ als auch bei „gemeldete Arbeitsstellen“ vorkommt.</w:t>
       </w:r>
     </w:p>
     <w:p>
@@ -398,7 +401,7 @@
     <w:p>
       <w:pPr/>
       <w:r>
-        <w:t>Nach dem Einlesen aller 15 Dateien ergibt sich folgender Datenüberblick:</w:t>
+        <w:t>Nach dem Einlesen aller 18 Dateien ergibt sich folgender Datenüberblick:</w:t>
       </w:r>
     </w:p>
     <w:p>
@@ -406,7 +409,7 @@
         <w:pStyle w:val="ListBullet"/>
       </w:pPr>
       <w:r>
-        <w:t>Shape: 465 Zeilen × 8 Spalten</w:t>
+        <w:t>Shape: 558 Zeilen × 8 Spalten</w:t>
       </w:r>
     </w:p>
     <w:p>
@@ -414,7 +417,7 @@
         <w:pStyle w:val="ListBullet"/>
       </w:pPr>
       <w:r>
-        <w:t>Abgedeckter Zeitraum: April 2025 bis Juni 2026 (15 Berichtsmonate)</w:t>
+        <w:t>Abgedeckter Zeitraum: Januar 2025 bis Juni 2026 (18 Berichtsmonate)</w:t>
       </w:r>
     </w:p>
     <w:p>
@@ -430,13 +433,13 @@
         <w:pStyle w:val="ListBullet"/>
       </w:pPr>
       <w:r>
-        <w:t>Fehlende Werte in der Spalte „sgb2“: 90 von 465 — diese betreffen fast ausschließlich die Kategorie „gemeldete Arbeitsstellen“, die von der Bundesagentur für Arbeit nicht nach Rechtskreis differenziert ausgewiesen wird und daher keinen SGB-II-Einzelwert besitzt.</w:t>
+        <w:t>Fehlende Werte in der Spalte „sgb2“: 108 von 558 — diese betreffen fast ausschließlich die Kategorie „gemeldete Arbeitsstellen“, die von der Bundesagentur für Arbeit nicht nach Rechtskreis differenziert ausgewiesen wird und daher keinen SGB-II-Einzelwert besitzt.</w:t>
       </w:r>
     </w:p>
     <w:p>
       <w:pPr/>
       <w:r>
-        <w:t>Die deskriptive Statistik (describe()) über alle SGB-II-Werte zeigt eine große Spannweite: Mittelwert 1.593,7, Median 869,0, Standardabweichung 1.499,7, Minimum 1,2, Maximum 5.421,1. Diese Spannweite ergibt sich daraus, dass die Spalte sowohl kleine Prozentwerte (z. B. Quoten um 1,3) als auch große Personenzahlen (z. B. Personen in Bedarfsgemeinschaften bis über 5.400) enthält — ein Hinweis darauf, dass für die eigentliche Analyse eine Trennung nach Kennzahlentyp sinnvoll ist (siehe Kapitel 2.4).</w:t>
+        <w:t>Die deskriptive Statistik (describe()) über alle SGB-II-Werte zeigt eine große Spannweite: Mittelwert 1.596,9, Median 862,0, Standardabweichung 1.511,5, Minimum 1,2, Maximum 5.488,0. Diese Spannweite ergibt sich daraus, dass die Spalte sowohl kleine Prozentwerte (z. B. Quoten um 1,3) als auch große Personenzahlen (z. B. Personen in Bedarfsgemeinschaften bis über 5.400) enthält — ein Hinweis darauf, dass für die eigentliche Analyse eine Trennung nach Kennzahlentyp sinnvoll ist (siehe Kapitel 2.4).</w:t>
       </w:r>
     </w:p>
     <w:p>
@@ -462,7 +465,7 @@
     <w:p>
       <w:pPr/>
       <w:r>
-        <w:t>Zusätzlich werden Mittelwert und Standardabweichung je Kennzahl direkt über NumPy berechnet und ausgegeben, u. a.: Arbeitslose (Bestand) Ø 1.520,4 (± 44,6), Langzeitarbeitslose Ø 621,5 (± 58,7), Bedarfsgemeinschaften Ø 2.674,4 (± 40,8), Personen in BG Ø 5.203,7 (± 82,9).</w:t>
+        <w:t>Zusätzlich werden Mittelwert und Standardabweichung je Kennzahl direkt über NumPy berechnet und ausgegeben, u. a.: Arbeitslose (Bestand) Ø 1.504,0 (± 56,8), Langzeitarbeitslose Ø 602,2 (± 68,8), Bedarfsgemeinschaften Ø 2.691,7 (± 54,1), Personen in BG Ø 5.247,4 (± 124,0).</w:t>
       </w:r>
     </w:p>
     <w:p>
@@ -515,6 +518,7 @@
       </w:r>
     </w:p>
     <w:p>
+      <w:pPr/>
       <w:r>
         <w:t>Aufbauend auf den in Kapitel 2 aufbereiteten Daten erfolgt in diesem Kapitel die inhaltliche Auswertung: die Entwicklung der zentralen SGB-II-Kennzahlen über die Zeit, ihre Visualisierung sowie die Einordnung der Ergebnisse. Dieser Teil entspricht dem Notebook „02_Analyse_SGBII.ipynb“.</w:t>
       </w:r>
@@ -576,7 +580,7 @@
           <w:color w:val="595959"/>
           <w:sz w:val="18"/>
         </w:rPr>
-        <w:t>Abbildung 1: Personen in Bedarfsgemeinschaften (Fläche) sowie Bedarfsgemeinschaften, Arbeitslose und Langzeitarbeitslose (überlappende Balken) im Zeitverlauf April 2025 – Juni 2026.</w:t>
+        <w:t>Abbildung 1: Personen in Bedarfsgemeinschaften (Fläche) sowie Bedarfsgemeinschaften, Arbeitslose und Langzeitarbeitslose (überlappende Balken) im Zeitverlauf Januar 2025 – Juni 2026.</w:t>
       </w:r>
     </w:p>
     <w:p/>
@@ -649,7 +653,7 @@
           <w:color w:val="595959"/>
           <w:sz w:val="18"/>
         </w:rPr>
-        <w:t>Abbildung 2: Arbeitslosenquote und Unterbeschäftigungsquote im Rechtskreis SGB II, April 2025 – Juni 2026. Beide Quoten bewegen sich in einer engen Bandbreite.</w:t>
+        <w:t>Abbildung 2: Arbeitslosenquote und Unterbeschäftigungsquote im Rechtskreis SGB II, Januar 2025 – Juni 2026. Beide Quoten bewegen sich in einer engen Bandbreite.</w:t>
       </w:r>
     </w:p>
     <w:p/>
@@ -662,7 +666,7 @@
     <w:p>
       <w:pPr/>
       <w:r>
-        <w:t>Im Beobachtungszeitraum schwankt die Arbeitslosenquote eng zwischen 1,2 % und 1,4 %, die Unterbeschäftigungsquote zwischen 1,7 % und 1,9 % — beide Kennzahlen sind über die 15 Monate hinweg als stabil zu bewerten.</w:t>
+        <w:t>Im Beobachtungszeitraum schwankt die Arbeitslosenquote eng zwischen 1,2 % und 1,4 %, die Unterbeschäftigungsquote zwischen 1,7 % und 1,9 % — beide Kennzahlen sind über die 18 Monate hinweg als stabil zu bewerten.</w:t>
       </w:r>
     </w:p>
     <w:p>
@@ -722,14 +726,14 @@
           <w:color w:val="595959"/>
           <w:sz w:val="18"/>
         </w:rPr>
-        <w:t>Abbildung 3: Anteil der Langzeitarbeitslosen an allen Arbeitslosen im SGB II. Deutlich sichtbarer Aufwärtstrend von 36,1 % (April 2025) auf 47,3 % (Juni 2026).</w:t>
+        <w:t>Abbildung 3: Anteil der Langzeitarbeitslosen an allen Arbeitslosen im SGB II. Deutlich sichtbarer Aufwärtstrend von 34,1 % (Januar 2025) auf 47,3 % (Juni 2026).</w:t>
       </w:r>
     </w:p>
     <w:p/>
     <w:p>
       <w:pPr/>
       <w:r>
-        <w:t>Langzeitarbeitslose sind Personen, die seit mindestens einem Jahr ununterbrochen als arbeitslos gemeldet sind. Diese Kennzahl zeigt im Beobachtungszeitraum den deutlichsten Trend im gesamten Datensatz: Die absolute Zahl ist von 526 (April 2025) auf 709 (Juni 2026) gestiegen, der Anteil an allen Arbeitslosen im Rechtskreis SGB II von 36,1 % auf 47,3 %.</w:t>
+        <w:t>Langzeitarbeitslose sind Personen, die seit mindestens einem Jahr ununterbrochen als arbeitslos gemeldet sind. Diese Kennzahl zeigt im Beobachtungszeitraum den deutlichsten Trend im gesamten Datensatz: Die absolute Zahl ist von 502 (Januar 2025) auf 709 (Juni 2026) gestiegen, der Anteil an allen Arbeitslosen im Rechtskreis SGB II von 34,1 % auf 47,3 %.</w:t>
       </w:r>
     </w:p>
     <w:p>
@@ -795,7 +799,7 @@
           <w:color w:val="595959"/>
           <w:sz w:val="18"/>
         </w:rPr>
-        <w:t>Abbildung 4: Die vier Kernkennzahlen indexiert auf den ersten Berichtsmonat (= 100 %). Der Index der Langzeitarbeitslosen steigt sichtbar über die der anderen Kennzahlen hinaus.</w:t>
+        <w:t>Abbildung 4: Die vier Kernkennzahlen indexiert auf den ersten Berichtsmonat (= 100 %). Der Index der Langzeitarbeitslosen steigt sichtbar über die anderen Kennzahlen hinaus.</w:t>
       </w:r>
     </w:p>
     <w:p/>
@@ -808,7 +812,7 @@
     <w:p>
       <w:pPr/>
       <w:r>
-        <w:t>Diese Darstellung macht sichtbar, dass sich die vier Kennzahlen trotz stabiler absoluter Größenordnungen unterschiedlich entwickeln: Während Bedarfsgemeinschaften und Personen in BG im Index leicht unter 100 % fallen (rückläufig), steigt der Index der Langzeitarbeitslosen deutlich über 130 % — der bereits in Kapitel 3.3 beschriebene Trend wird hier im direkten Vergleich noch klarer erkennbar.</w:t>
+        <w:t>Diese Darstellung macht sichtbar, dass sich die vier Kennzahlen trotz stabiler absoluter Größenordnungen unterschiedlich entwickeln: Während Bedarfsgemeinschaften und Personen in BG im Index unter 100 % fallen (rückläufig), steigt der Index der Langzeitarbeitslosen deutlich über 140 % — der bereits in Kapitel 3.3 beschriebene Trend wird hier im direkten Vergleich noch klarer erkennbar.</w:t>
       </w:r>
     </w:p>
     <w:p>
@@ -875,7 +879,7 @@
     <w:p>
       <w:pPr/>
       <w:r>
-        <w:t>Für den jeweils aktuellsten Berichtsmonat (Juni 2026) zeigen zwei Balkendiagramme die Struktur der SGB-II-Arbeitslosen: nach Altersgruppen (15 bis unter 25 Jahre, 25 bis unter 50 Jahre, 50 Jahre und älter) sowie nach Geschlecht (Männer/Frauen). Es handelt sich dabei um eine reine Momentaufnahme, keine Zeitreihe — die zeitliche Entwicklung dieser Merkmale ist als mögliche Erweiterung in Kapitel 4 vorgemerkt.</w:t>
+        <w:t>Für den jeweils aktuellsten Berichtsmonat (Juni 2026) zeigen zwei Balkendiagramme die Struktur der SGB-II-Arbeitslosen: nach Altersgruppen (15 bis unter 25 Jahre, 25 bis unter 50 Jahre, 50 Jahre und älter) sowie nach Geschlecht (Männer/Frauen). Es handelt sich dabei um eine reine Momentaufnahme, keine Zeitreihe — die zeitliche Entwicklung dieser Merkmale ist als mögliche Erweiterung in Kapitel 5 vorgemerkt.</w:t>
       </w:r>
     </w:p>
     <w:p>
@@ -935,7 +939,7 @@
     <w:p>
       <w:pPr/>
       <w:r>
-        <w:t>Auf Basis der 15 Monatsberichte (April 2025 bis Juni 2026) für das Jobcenter Regensburg (Rechtskreis SGB II) lassen sich folgende zentrale Befunde festhalten:</w:t>
+        <w:t>Auf Basis der 18 Monatsberichte (Januar 2025 bis Juni 2026) für das Jobcenter Regensburg (Rechtskreis SGB II) lassen sich folgende zentrale Befunde festhalten:</w:t>
       </w:r>
     </w:p>
     <w:p>
@@ -943,7 +947,7 @@
         <w:pStyle w:val="ListBullet"/>
       </w:pPr>
       <w:r>
-        <w:t>Arbeitslose (Bestand): von 1.457 (April 2025) auf 1.500 (Juni 2026) — leicht gestiegen, mit einem Zwischenhoch von 1.587 im August 2025 und einem Tiefpunkt von 1.438 im Mai 2025.</w:t>
+        <w:t>Arbeitslose (Bestand): von 1.470 (Januar 2025) auf 1.500 (Juni 2026) — leicht gestiegen, mit einem Zwischenhoch von 1.587 im August 2025 und einem Tiefpunkt von 1.382 im Februar 2025.</w:t>
       </w:r>
     </w:p>
     <w:p>
@@ -959,7 +963,7 @@
         <w:pStyle w:val="ListBullet"/>
       </w:pPr>
       <w:r>
-        <w:t>Langzeitarbeitslosigkeit: deutlichster Trend im Datensatz — von 526 auf 709 Personen (+ rund 35 %), mit einem Höchststand von 714 im Mai 2026. Der Anteil an allen Arbeitslosen ist damit spürbar gestiegen.</w:t>
+        <w:t>Langzeitarbeitslosigkeit: deutlichster Trend im Datensatz — von 502 auf 709 Personen (+ rund 41 %), mit einem Höchststand von 714 im Mai 2026. Der Anteil an allen Arbeitslosen ist damit von 34,1 % auf 47,3 % spürbar gestiegen.</w:t>
       </w:r>
     </w:p>
     <w:p>
@@ -967,7 +971,7 @@
         <w:pStyle w:val="ListBullet"/>
       </w:pPr>
       <w:r>
-        <w:t>Bedarfsgemeinschaften / Personen im Leistungsbezug: beide Kennzahlen sind rückläufig (Bedarfsgemeinschaften: 2.767 → 2.673; Personen in BG: 5.421 → 5.150, jeweils ca. −5 %).</w:t>
+        <w:t>Bedarfsgemeinschaften / Personen im Leistungsbezug: beide Kennzahlen sind rückläufig (Bedarfsgemeinschaften: 2.797 → 2.673, ca. −4 %; Personen in BG: 5.488 → 5.150, ca. −6 %).</w:t>
       </w:r>
     </w:p>
     <w:p>
@@ -986,7 +990,496 @@
         <w:pStyle w:val="Heading1"/>
       </w:pPr>
       <w:r>
-        <w:t>4 Fazit und Ausblick</w:t>
+        <w:t>4 Vertiefte statistische Analyse</w:t>
+      </w:r>
+    </w:p>
+    <w:p>
+      <w:pPr/>
+      <w:r>
+        <w:t>Ergänzend zur inhaltlichen Auswertung in Kapitel 3 wurden im Notebook „03_Statistik.ipynb“ vertiefte statistische Verfahren auf die 18 Monatswerte (Januar 2025 – Juni 2026) angewendet: deskriptive Statistik im Detail, Korrelationsanalyse, Verteilungsanalyse, ein Hypothesentest sowie eine einfache lineare Regression. Da die Zeitreihe nur 18 Beobachtungen umfasst, sind die Ergebnisse mit der gebotenen Vorsicht zu interpretieren.</w:t>
+      </w:r>
+    </w:p>
+    <w:p>
+      <w:pPr>
+        <w:pStyle w:val="Heading2"/>
+      </w:pPr>
+      <w:r>
+        <w:t>4.1 Deskriptive Statistik im Detail</w:t>
+      </w:r>
+    </w:p>
+    <w:p>
+      <w:pPr/>
+      <w:r>
+        <w:t>Über describe() und Mittelwert/Standardabweichung hinaus wurden zusätzlich Median, Varianz, Interquartilsabstand (IQR) sowie der Variationskoeffizient (CV = Standardabweichung / Mittelwert, in %) berechnet. Der CV macht die vier Kernkennzahlen trotz unterschiedlicher Größenordnungen bezüglich ihrer relativen Streuung vergleichbar:</w:t>
+      </w:r>
+    </w:p>
+    <w:p>
+      <w:pPr>
+        <w:pStyle w:val="ListBullet"/>
+      </w:pPr>
+      <w:r>
+        <w:t>Arbeitslose (Bestand): Ø 1.504,0, Median 1.513,0, CV ≈ 3,9 %</w:t>
+      </w:r>
+    </w:p>
+    <w:p>
+      <w:pPr>
+        <w:pStyle w:val="ListBullet"/>
+      </w:pPr>
+      <w:r>
+        <w:t>Langzeitarbeitslose: Ø 602,2, Median 599,0, CV ≈ 11,8 %</w:t>
+      </w:r>
+    </w:p>
+    <w:p>
+      <w:pPr>
+        <w:pStyle w:val="ListBullet"/>
+      </w:pPr>
+      <w:r>
+        <w:t>Bedarfsgemeinschaften: Ø 2.691,7, Median 2.692,1, CV ≈ 2,1 %</w:t>
+      </w:r>
+    </w:p>
+    <w:p>
+      <w:pPr>
+        <w:pStyle w:val="ListBullet"/>
+      </w:pPr>
+      <w:r>
+        <w:t>Personen in BG: Ø 5.247,4, Median 5.216,6, CV ≈ 2,4 %</w:t>
+      </w:r>
+    </w:p>
+    <w:p>
+      <w:pPr/>
+      <w:r>
+        <w:t>Die Langzeitarbeitslosen weisen mit rund 11,8 % den mit Abstand höchsten Variationskoeffizienten aller vier Kernkennzahlen auf — ein quantitativer Beleg dafür, dass sich diese Kennzahl im Beobachtungszeitraum relativ am stärksten verändert hat, während Bedarfsgemeinschaften (2,1 %) und Personen in BG (2,4 %) vergleichsweise stabil sind.</w:t>
+      </w:r>
+    </w:p>
+    <w:p>
+      <w:pPr>
+        <w:pStyle w:val="Heading2"/>
+      </w:pPr>
+      <w:r>
+        <w:t>4.2 Korrelationsanalyse</w:t>
+      </w:r>
+    </w:p>
+    <w:p>
+      <w:pPr>
+        <w:jc w:val="center"/>
+      </w:pPr>
+      <w:r>
+        <w:drawing>
+          <wp:inline xmlns:a="http://schemas.openxmlformats.org/drawingml/2006/main" xmlns:pic="http://schemas.openxmlformats.org/drawingml/2006/picture">
+            <wp:extent cx="5400000" cy="4153846"/>
+            <wp:docPr id="6" name="Picture 6"/>
+            <wp:cNvGraphicFramePr>
+              <a:graphicFrameLocks noChangeAspect="1"/>
+            </wp:cNvGraphicFramePr>
+            <a:graphic>
+              <a:graphicData uri="http://schemas.openxmlformats.org/drawingml/2006/picture">
+                <pic:pic>
+                  <pic:nvPicPr>
+                    <pic:cNvPr id="0" name="abb6_korrelation.png"/>
+                    <pic:cNvPicPr/>
+                  </pic:nvPicPr>
+                  <pic:blipFill>
+                    <a:blip r:embed="rId14"/>
+                    <a:stretch>
+                      <a:fillRect/>
+                    </a:stretch>
+                  </pic:blipFill>
+                  <pic:spPr>
+                    <a:xfrm>
+                      <a:off x="0" y="0"/>
+                      <a:ext cx="5400000" cy="4153846"/>
+                    </a:xfrm>
+                    <a:prstGeom prst="rect"/>
+                  </pic:spPr>
+                </pic:pic>
+              </a:graphicData>
+            </a:graphic>
+          </wp:inline>
+        </w:drawing>
+      </w:r>
+    </w:p>
+    <w:p>
+      <w:pPr>
+        <w:jc w:val="center"/>
+      </w:pPr>
+      <w:r>
+        <w:rPr>
+          <w:i/>
+          <w:color w:val="595959"/>
+          <w:sz w:val="18"/>
+        </w:rPr>
+        <w:t>Abbildung 6: Pearson-Korrelationsmatrix der vier Kernkennzahlen.</w:t>
+      </w:r>
+    </w:p>
+    <w:p/>
+    <w:p>
+      <w:pPr/>
+      <w:r>
+        <w:t>Die Pearson-Korrelationsmatrix zeigt lineare Zusammenhänge zwischen den vier Kernkennzahlen: Werte nahe +1/−1 bedeuten einen starken positiven/negativen linearen Zusammenhang, Werte nahe 0 keinen linearen Zusammenhang. Auffälligster Wert ist r ≈ 0,95 zwischen Bedarfsgemeinschaften und Personen in BG — plausibel, da die Personenzahl direkt aus der Zahl der Bedarfsgemeinschaften hervorgeht.</w:t>
+      </w:r>
+    </w:p>
+    <w:p>
+      <w:pPr>
+        <w:jc w:val="center"/>
+      </w:pPr>
+      <w:r>
+        <w:drawing>
+          <wp:inline xmlns:a="http://schemas.openxmlformats.org/drawingml/2006/main" xmlns:pic="http://schemas.openxmlformats.org/drawingml/2006/picture">
+            <wp:extent cx="5400000" cy="2700000"/>
+            <wp:docPr id="7" name="Picture 7"/>
+            <wp:cNvGraphicFramePr>
+              <a:graphicFrameLocks noChangeAspect="1"/>
+            </wp:cNvGraphicFramePr>
+            <a:graphic>
+              <a:graphicData uri="http://schemas.openxmlformats.org/drawingml/2006/picture">
+                <pic:pic>
+                  <pic:nvPicPr>
+                    <pic:cNvPr id="0" name="abb7_streudiagramm.png"/>
+                    <pic:cNvPicPr/>
+                  </pic:nvPicPr>
+                  <pic:blipFill>
+                    <a:blip r:embed="rId15"/>
+                    <a:stretch>
+                      <a:fillRect/>
+                    </a:stretch>
+                  </pic:blipFill>
+                  <pic:spPr>
+                    <a:xfrm>
+                      <a:off x="0" y="0"/>
+                      <a:ext cx="5400000" cy="2700000"/>
+                    </a:xfrm>
+                    <a:prstGeom prst="rect"/>
+                  </pic:spPr>
+                </pic:pic>
+              </a:graphicData>
+            </a:graphic>
+          </wp:inline>
+        </w:drawing>
+      </w:r>
+    </w:p>
+    <w:p>
+      <w:pPr>
+        <w:jc w:val="center"/>
+      </w:pPr>
+      <w:r>
+        <w:rPr>
+          <w:i/>
+          <w:color w:val="595959"/>
+          <w:sz w:val="18"/>
+        </w:rPr>
+        <w:t>Abbildung 7: Streudiagramm Langzeitarbeitslose vs. Bedarfsgemeinschaften mit OLS-Trendlinie.</w:t>
+      </w:r>
+    </w:p>
+    <w:p/>
+    <w:p>
+      <w:pPr/>
+      <w:r>
+        <w:t>Mit r = −0,49 und p = 0,04 besteht ein statistisch signifikanter, moderater negativer Zusammenhang zwischen Langzeitarbeitslosen und Bedarfsgemeinschaften: Je höher die Langzeitarbeitslosigkeit, desto niedriger tendenziell die Zahl der Bedarfsgemeinschaften im selben Monat — inhaltlich plausibel, da Bedarfsgemeinschaften über den Beobachtungszeitraum insgesamt leicht sinken, während die Langzeitarbeitslosigkeit steigt. Bei den ursprünglichen 15 Monaten war dieser Zusammenhang mit r = −0,08 (p = 0,78) noch nicht nachweisbar — ein gutes Beispiel dafür, wie empfindlich Korrelationsschätzungen bei kleinen Stichproben auf zusätzliche Datenpunkte reagieren. Noch deutlicher zeigt sich der Zusammenhang zwischen Langzeitarbeitslosen und dem allgemeinen Arbeitslosenbestand: r = 0,67 (p = 0,002) — jetzt klar signifikant, während er mit 15 Monaten noch knapp unter der Signifikanzschwelle lag (r = 0,48, p = 0,07).</w:t>
+      </w:r>
+    </w:p>
+    <w:p>
+      <w:pPr>
+        <w:pStyle w:val="Heading2"/>
+      </w:pPr>
+      <w:r>
+        <w:t>4.3 Verteilungen</w:t>
+      </w:r>
+    </w:p>
+    <w:p>
+      <w:pPr>
+        <w:jc w:val="center"/>
+      </w:pPr>
+      <w:r>
+        <w:drawing>
+          <wp:inline xmlns:a="http://schemas.openxmlformats.org/drawingml/2006/main" xmlns:pic="http://schemas.openxmlformats.org/drawingml/2006/picture">
+            <wp:extent cx="5400000" cy="2387368"/>
+            <wp:docPr id="8" name="Picture 8"/>
+            <wp:cNvGraphicFramePr>
+              <a:graphicFrameLocks noChangeAspect="1"/>
+            </wp:cNvGraphicFramePr>
+            <a:graphic>
+              <a:graphicData uri="http://schemas.openxmlformats.org/drawingml/2006/picture">
+                <pic:pic>
+                  <pic:nvPicPr>
+                    <pic:cNvPr id="0" name="abb8_verteilung.png"/>
+                    <pic:cNvPicPr/>
+                  </pic:nvPicPr>
+                  <pic:blipFill>
+                    <a:blip r:embed="rId16"/>
+                    <a:stretch>
+                      <a:fillRect/>
+                    </a:stretch>
+                  </pic:blipFill>
+                  <pic:spPr>
+                    <a:xfrm>
+                      <a:off x="0" y="0"/>
+                      <a:ext cx="5400000" cy="2387368"/>
+                    </a:xfrm>
+                    <a:prstGeom prst="rect"/>
+                  </pic:spPr>
+                </pic:pic>
+              </a:graphicData>
+            </a:graphic>
+          </wp:inline>
+        </w:drawing>
+      </w:r>
+    </w:p>
+    <w:p>
+      <w:pPr>
+        <w:jc w:val="center"/>
+      </w:pPr>
+      <w:r>
+        <w:rPr>
+          <w:i/>
+          <w:color w:val="595959"/>
+          <w:sz w:val="18"/>
+        </w:rPr>
+        <w:t>Abbildung 8: Histogramm und Boxplot der Verteilung von Arbeitslose (Bestand) über die 18 Berichtsmonate.</w:t>
+      </w:r>
+    </w:p>
+    <w:p/>
+    <w:p>
+      <w:pPr/>
+      <w:r>
+        <w:t>Der Boxplot zeigt keine auffälligen Ausreißer (keine Punkte außerhalb der Whisker); die Verteilung ist leicht linksschief mit einem Median (1.513,0) knapp über dem Mittelwert (1.504,0, siehe Kapitel 4.1).</w:t>
+      </w:r>
+    </w:p>
+    <w:p>
+      <w:pPr>
+        <w:pStyle w:val="Heading2"/>
+      </w:pPr>
+      <w:r>
+        <w:t>4.4 Inferenzstatistik: Hypothesentest</w:t>
+      </w:r>
+    </w:p>
+    <w:p>
+      <w:pPr/>
+      <w:r>
+        <w:t>Fragestellung: Unterscheidet sich die durchschnittliche Zahl der Langzeitarbeitslosen in der zweiten Hälfte des Beobachtungszeitraums signifikant von der ersten Hälfte? Hypothesen: H₀ — kein Unterschied der Mittelwerte; H₁ — die zweite Hälfte hat einen höheren Mittelwert. Getestet wurde mit einem zweiseitigen Welch-t-Test (ungleiche Varianzen werden nicht vorausgesetzt), Signifikanzniveau α = 0,05.</w:t>
+      </w:r>
+    </w:p>
+    <w:p>
+      <w:pPr>
+        <w:pStyle w:val="ListBullet"/>
+      </w:pPr>
+      <w:r>
+        <w:t>1. Hälfte (n = 9): Ø 543,3 (± 34,1) Personen</w:t>
+      </w:r>
+    </w:p>
+    <w:p>
+      <w:pPr>
+        <w:pStyle w:val="ListBullet"/>
+      </w:pPr>
+      <w:r>
+        <w:t>2. Hälfte (n = 9): Ø 661,1 (± 41,2) Personen</w:t>
+      </w:r>
+    </w:p>
+    <w:p>
+      <w:pPr>
+        <w:pStyle w:val="ListBullet"/>
+      </w:pPr>
+      <w:r>
+        <w:t>Mittelwertdifferenz: 117,8 Personen (95 %-Konfidenzintervall: [82,8; 152,7])</w:t>
+      </w:r>
+    </w:p>
+    <w:p>
+      <w:pPr>
+        <w:pStyle w:val="ListBullet"/>
+      </w:pPr>
+      <w:r>
+        <w:t>Welch-t-Test: t = 6,61, p ≈ 0,00001</w:t>
+      </w:r>
+    </w:p>
+    <w:p>
+      <w:pPr/>
+      <w:r>
+        <w:t>Mit p ≈ 0,00001 (deutlich unter α = 0,05) wird H₀ verworfen — der Anstieg der Langzeitarbeitslosigkeit von durchschnittlich 543 (erste Hälfte des Zeitraums) auf 661 Personen (zweite Hälfte) ist statistisch hoch signifikant, nicht durch zufällige Schwankungen erklärbar. Das 95 %-Konfidenzintervall für die Differenz (ca. 83 bis 153 Personen) schließt die Null nicht ein, was die Signifikanz bestätigt.</w:t>
+      </w:r>
+    </w:p>
+    <w:p>
+      <w:pPr>
+        <w:pStyle w:val="Heading2"/>
+      </w:pPr>
+      <w:r>
+        <w:t>4.5 Regressionsanalyse: Trend der Langzeitarbeitslosigkeit</w:t>
+      </w:r>
+    </w:p>
+    <w:p>
+      <w:pPr/>
+      <w:r>
+        <w:t>Einfache lineare Regression der Langzeitarbeitslosen-Zahl über die Zeit (Monatsindex 0 = Januar 2025 bis 17 = Juni 2026), umgesetzt mit sklearn.linear_model.LinearRegression:</w:t>
+      </w:r>
+    </w:p>
+    <w:p>
+      <w:pPr>
+        <w:pStyle w:val="ListBullet"/>
+      </w:pPr>
+      <w:r>
+        <w:t>Regressionsgleichung: Langzeitarbeitslose = 490,4 + 13,16 × Monatsindex</w:t>
+      </w:r>
+    </w:p>
+    <w:p>
+      <w:pPr>
+        <w:pStyle w:val="ListBullet"/>
+      </w:pPr>
+      <w:r>
+        <w:t>Steigung: +13,2 Personen pro Monat</w:t>
+      </w:r>
+    </w:p>
+    <w:p>
+      <w:pPr>
+        <w:pStyle w:val="ListBullet"/>
+      </w:pPr>
+      <w:r>
+        <w:t>Bestimmtheitsmaß: R² = 0,983</w:t>
+      </w:r>
+    </w:p>
+    <w:p>
+      <w:pPr>
+        <w:pStyle w:val="ListBullet"/>
+      </w:pPr>
+      <w:r>
+        <w:t>Prognose Juli 2026: rund 727 Personen</w:t>
+      </w:r>
+    </w:p>
+    <w:p>
+      <w:pPr>
+        <w:pStyle w:val="ListBullet"/>
+      </w:pPr>
+      <w:r>
+        <w:t>Prognose August 2026: rund 740 Personen</w:t>
+      </w:r>
+    </w:p>
+    <w:p>
+      <w:pPr>
+        <w:pStyle w:val="ListBullet"/>
+      </w:pPr>
+      <w:r>
+        <w:t>Prognose September 2026: rund 754 Personen</w:t>
+      </w:r>
+    </w:p>
+    <w:p>
+      <w:pPr>
+        <w:jc w:val="center"/>
+      </w:pPr>
+      <w:r>
+        <w:drawing>
+          <wp:inline xmlns:a="http://schemas.openxmlformats.org/drawingml/2006/main" xmlns:pic="http://schemas.openxmlformats.org/drawingml/2006/picture">
+            <wp:extent cx="5400000" cy="2728421"/>
+            <wp:docPr id="9" name="Picture 9"/>
+            <wp:cNvGraphicFramePr>
+              <a:graphicFrameLocks noChangeAspect="1"/>
+            </wp:cNvGraphicFramePr>
+            <a:graphic>
+              <a:graphicData uri="http://schemas.openxmlformats.org/drawingml/2006/picture">
+                <pic:pic>
+                  <pic:nvPicPr>
+                    <pic:cNvPr id="0" name="abb9_regression.png"/>
+                    <pic:cNvPicPr/>
+                  </pic:nvPicPr>
+                  <pic:blipFill>
+                    <a:blip r:embed="rId17"/>
+                    <a:stretch>
+                      <a:fillRect/>
+                    </a:stretch>
+                  </pic:blipFill>
+                  <pic:spPr>
+                    <a:xfrm>
+                      <a:off x="0" y="0"/>
+                      <a:ext cx="5400000" cy="2728421"/>
+                    </a:xfrm>
+                    <a:prstGeom prst="rect"/>
+                  </pic:spPr>
+                </pic:pic>
+              </a:graphicData>
+            </a:graphic>
+          </wp:inline>
+        </w:drawing>
+      </w:r>
+    </w:p>
+    <w:p>
+      <w:pPr>
+        <w:jc w:val="center"/>
+      </w:pPr>
+      <w:r>
+        <w:rPr>
+          <w:i/>
+          <w:color w:val="595959"/>
+          <w:sz w:val="18"/>
+        </w:rPr>
+        <w:t>Abbildung 9: Langzeitarbeitslose — linearer Trend, Regressionsgerade und Prognose für die folgenden drei Monate.</w:t>
+      </w:r>
+    </w:p>
+    <w:p/>
+    <w:p>
+      <w:pPr/>
+      <w:r>
+        <w:t>Mit R² = 0,983 erklärt die lineare Zeit-Trendlinie rund 98,3 % der Schwankung der Langzeitarbeitslosen-Zahl — ein außergewöhnlich guter linearer Fit, sogar noch etwas besser als mit den ursprünglichen 15 Monaten (R² = 0,976). Die Steigung von +13,2 Personen pro Monat entspricht der bereits in Kapitel 3.3/3.4 beschriebenen Entwicklung. Die Prognose für die folgenden drei Monate (Juli–September 2026) liegt bei rund 727, 740 und 754 Personen.</w:t>
+      </w:r>
+    </w:p>
+    <w:p>
+      <w:pPr/>
+      <w:r>
+        <w:t>Einschränkung: Die Prognose extrapoliert einen linearen Trend aus nur 18 Datenpunkten in die Zukunft. Sie unterstellt, dass sich der bisherige Trend unverändert fortsetzt, und berücksichtigt keine saisonalen Effekte, Strukturbrüche oder externe Einflüsse (z. B. konjunkturelle Entwicklung, Gesetzesänderungen). Die Prognose ist daher als grobe Orientierung zu verstehen, nicht als verlässliche Vorhersage.</w:t>
+      </w:r>
+    </w:p>
+    <w:p>
+      <w:pPr>
+        <w:pStyle w:val="Heading2"/>
+      </w:pPr>
+      <w:r>
+        <w:t>4.6 Zusammenfassung der statistischen Befunde</w:t>
+      </w:r>
+    </w:p>
+    <w:p>
+      <w:pPr>
+        <w:pStyle w:val="ListBullet"/>
+      </w:pPr>
+      <w:r>
+        <w:t>Deskriptive Statistik: Langzeitarbeitslose weisen mit einem Variationskoeffizienten von rund 11,8 % die stärkste relative Veränderung aller vier Kernkennzahlen auf; Bedarfsgemeinschaften (2,1 %) und Personen in BG (2,4 %) sind am stabilsten.</w:t>
+      </w:r>
+    </w:p>
+    <w:p>
+      <w:pPr>
+        <w:pStyle w:val="ListBullet"/>
+      </w:pPr>
+      <w:r>
+        <w:t>Korrelation: Mit den jetzt 18 Monaten zeigt sich ein statistisch signifikanter, moderater negativer Zusammenhang zwischen Langzeitarbeitslosen und Bedarfsgemeinschaften (r = −0,49, p = 0,04) sowie ein deutlicher positiver Zusammenhang zwischen Langzeitarbeitslosen und dem allgemeinen Arbeitslosenbestand (r = 0,67, p = 0,002) — beide Zusammenhänge waren mit den ursprünglichen 15 Monaten noch nicht signifikant nachweisbar. Bedarfsgemeinschaften und Personen in BG korrelieren weiterhin sehr stark (r ≈ 0,95).</w:t>
+      </w:r>
+    </w:p>
+    <w:p>
+      <w:pPr>
+        <w:pStyle w:val="ListBullet"/>
+      </w:pPr>
+      <w:r>
+        <w:t>Hypothesentest: Der Anstieg der Langzeitarbeitslosigkeit zwischen erster (Ø 543) und zweiter (Ø 661) Hälfte des Beobachtungszeitraums ist statistisch hoch signifikant (p ≈ 0,00001).</w:t>
+      </w:r>
+    </w:p>
+    <w:p>
+      <w:pPr>
+        <w:pStyle w:val="ListBullet"/>
+      </w:pPr>
+      <w:r>
+        <w:t>Regression: Ein linearer Zeittrend erklärt mit R² = 0,983 nahezu die gesamte Schwankung der Langzeitarbeitslosen-Zahl; die Prognose für die kommenden drei Monate liegt bei weiterem Anstieg auf rund 727–754 Personen — allerdings mit den oben genannten Einschränkungen einer einfachen linearen Extrapolation.</w:t>
+      </w:r>
+    </w:p>
+    <w:p>
+      <w:pPr/>
+      <w:r>
+        <w:t>Diese statistischen Befunde untermauern quantitativ, was in Kapitel 3 bereits visuell erkennbar war: Die Verschärfung der Langzeitarbeitslosigkeit ist der mit Abstand robusteste und am stärksten abgesicherte Trend im gesamten Datensatz. Bemerkenswert ist zudem, dass die zusätzlichen drei Monate Rohdaten zwei zuvor statistisch nicht nachweisbare Zusammenhänge (Korrelation mit Bedarfsgemeinschaften und mit dem Arbeitslosenbestand) erst sichtbar gemacht haben — ein anschauliches Beispiel für die Bedeutung der Stichprobengröße bei Signifikanztests.</w:t>
+      </w:r>
+    </w:p>
+    <w:p>
+      <w:r>
+        <w:br w:type="page"/>
+      </w:r>
+    </w:p>
+    <w:p>
+      <w:pPr>
+        <w:pStyle w:val="Heading1"/>
+      </w:pPr>
+      <w:r>
+        <w:t>5 Fazit und Ausblick</w:t>
       </w:r>
     </w:p>
     <w:p>
@@ -1000,13 +1493,13 @@
     <w:p>
       <w:pPr/>
       <w:r>
-        <w:t>Das Projekt hat gezeigt, dass sich aus den monatlichen Rohdaten der Bundesagentur für Arbeit mit vertretbarem Aufwand eine saubere, reproduzierbare Datenpipeline sowie aussagekräftige Visualisierungen aufbauen lassen. Aus 15 Excel-Berichten mit jeweils über 20 Tabellenblättern wurde eine strukturierte Zeitreihe mit neun zentralen SGB-II-Kennzahlen erstellt (Kapitel 2), die in fünf interaktiven Diagrammen sowie einer Kennzahlen-Vergleichstabelle ausgewertet wurde (Kapitel 3). Die Ergebnisse sind zusätzlich in einem öffentlich zugänglichen Streamlit-Dashboard bereitgestellt, sodass sie über die reine Projektdokumentation hinaus nutzbar bleiben.</w:t>
+        <w:t>Das Projekt hat gezeigt, dass sich aus den monatlichen Rohdaten der Bundesagentur für Arbeit mit vertretbarem Aufwand eine saubere, reproduzierbare Datenpipeline sowie aussagekräftige Visualisierungen aufbauen lassen. Aus 18 Excel-Berichten mit jeweils über 20 Tabellenblättern wurde eine strukturierte Zeitreihe mit neun zentralen SGB-II-Kennzahlen erstellt (Kapitel 2), die in fünf interaktiven Diagrammen sowie einer Kennzahlen-Vergleichstabelle ausgewertet wurde (Kapitel 3). Die Ergebnisse sind zusätzlich in einem öffentlich zugänglichen Streamlit-Dashboard bereitgestellt, sodass sie über die reine Projektdokumentation hinaus nutzbar bleiben.</w:t>
       </w:r>
     </w:p>
     <w:p>
       <w:pPr/>
       <w:r>
-        <w:t>Inhaltlich zeigt die Analyse für das Jobcenter Regensburg im Zeitraum April 2025 bis Juni 2026 ein differenziertes Bild: Während der Arbeitslosenbestand und die Arbeitslosenquote über den Beobachtungszeitraum weitgehend stabil geblieben sind, hat sich die Langzeitarbeitslosigkeit spürbar verschärft (Anteil an allen Arbeitslosen von 36,1 % auf 47,3 % gestiegen), während die Zahl der Bedarfsgemeinschaften und der Personen im Leistungsbezug leicht rückläufig war. Diese gegenläufige Entwicklung wäre in den Rohdaten allein kaum erkennbar gewesen und verdeutlicht den Mehrwert der strukturierten Aufbereitung und Visualisierung.</w:t>
+        <w:t>Inhaltlich zeigt die Analyse für das Jobcenter Regensburg im Zeitraum Januar 2025 bis Juni 2026 ein differenziertes Bild: Während der Arbeitslosenbestand und die Arbeitslosenquote über den Beobachtungszeitraum weitgehend stabil geblieben sind, hat sich die Langzeitarbeitslosigkeit spürbar verschärft (Anteil an allen Arbeitslosen von 34,1 % auf 47,3 % gestiegen), während die Zahl der Bedarfsgemeinschaften und der Personen im Leistungsbezug leicht rückläufig war. Diese gegenläufige Entwicklung wäre in den Rohdaten allein kaum erkennbar gewesen und verdeutlicht den Mehrwert der strukturierten Aufbereitung und Visualisierung.</w:t>
       </w:r>
     </w:p>
     <w:p>
@@ -1080,7 +1573,7 @@
     <w:p>
       <w:pPr/>
       <w:r>
-        <w:t>Auch methodisch bietet die Analyse weiteres Potenzial: bislang nicht eingesetzt wurden u. a. Korrelationsanalysen und Streudiagramme (z. B. zwischen Langzeitarbeitslosigkeit und Bedarfsgemeinschaften), Verteilungsdarstellungen wie Histogramm oder Boxplot sowie eine einfache Regressionsanalyse zur Trendfortschreibung.</w:t>
+        <w:t>Auch methodisch bietet die Analyse weiteres Potenzial über die in Kapitel 4 dokumentierte vertiefte Statistik hinaus: bislang nicht eingesetzt wurden u. a. eine multiple Regression mit mehreren Prädiktoren, eine ANOVA für Mehrgruppenvergleiche sowie Verteilungsdarstellungen wie Violin- oder Pie-Plots.</w:t>
       </w:r>
     </w:p>
     <w:p>
@@ -1097,8 +1590,9 @@
       </w:r>
     </w:p>
     <w:p>
+      <w:pPr/>
       <w:r>
-        <w:t>Statistik der Bundesagentur für Arbeit: Eckwerte für Jobcenter, Jobcenter Regensburg (Statistik-Nr. t73906-0), monatliche Berichte April 2025 – Juni 2026. https://statistik.arbeitsagentur.de</w:t>
+        <w:t>Statistik der Bundesagentur für Arbeit: Eckwerte für Jobcenter, Jobcenter Regensburg (Statistik-Nr. t73906-0), monatliche Berichte Januar 2025 – Juni 2026. https://statistik.arbeitsagentur.de</w:t>
       </w:r>
     </w:p>
     <w:sectPr>

</xml_diff>